<commit_message>
Rewrite beginner-friendly seminar script from the latest discussion
Fold in retirement-via-work framing, Oct 2026 baseline, the under/over-51 gap, and the three choices in plain language for a non-expert instructor.

Co-authored-by: love2u2aya <love2u2aya@users.noreply.github.com>
</commit_message>
<xml_diff>
--- a/seminar-materials/カンニング用アジェンダ_Googleドキュメント用.docx
+++ b/seminar-materials/カンニング用アジェンダ_Googleドキュメント用.docx
@@ -3,31 +3,13 @@
 <w:document xmlns:wpc="http://schemas.microsoft.com/office/word/2010/wordprocessingCanvas" xmlns:mo="http://schemas.microsoft.com/office/mac/office/2008/main" xmlns:mc="http://schemas.openxmlformats.org/markup-compatibility/2006" xmlns:mv="urn:schemas-microsoft-com:mac:vml" xmlns:o="urn:schemas-microsoft-com:office:office" xmlns:r="http://schemas.openxmlformats.org/officeDocument/2006/relationships" xmlns:m="http://schemas.openxmlformats.org/officeDocument/2006/math" xmlns:v="urn:schemas-microsoft-com:vml" xmlns:wp14="http://schemas.microsoft.com/office/word/2010/wordprocessingDrawing" xmlns:wp="http://schemas.openxmlformats.org/drawingml/2006/wordprocessingDrawing" xmlns:w10="urn:schemas-microsoft-com:office:word" xmlns:w="http://schemas.openxmlformats.org/wordprocessingml/2006/main" xmlns:w14="http://schemas.microsoft.com/office/word/2010/wordml" xmlns:wpg="http://schemas.microsoft.com/office/word/2010/wordprocessingGroup" xmlns:wpi="http://schemas.microsoft.com/office/word/2010/wordprocessingInk" xmlns:wne="http://schemas.microsoft.com/office/word/2006/wordml" xmlns:wps="http://schemas.microsoft.com/office/word/2010/wordprocessingShape" mc:Ignorable="w14 wp14">
   <w:body>
     <w:p>
-      <w:pPr>
-        <w:jc w:val="left"/>
-      </w:pPr>
       <w:r>
         <w:rPr>
           <w:rFonts w:ascii="Yu Gothic" w:hAnsi="Yu Gothic" w:eastAsia="Yu Gothic"/>
           <w:b/>
-          <w:color w:val="1E4078"/>
           <w:sz w:val="36"/>
         </w:rPr>
-        <w:t>カンニング用アジェンダ（15分）</w:t>
-      </w:r>
-    </w:p>
-    <w:p>
-      <w:pPr>
-        <w:spacing w:after="120"/>
-      </w:pPr>
-      <w:r>
-        <w:rPr>
-          <w:rFonts w:ascii="Yu Gothic" w:hAnsi="Yu Gothic" w:eastAsia="Yu Gothic"/>
-          <w:b w:val="0"/>
-          <w:color w:val="64748B"/>
-          <w:sz w:val="18"/>
-        </w:rPr>
-        <w:t>※ Googleドライブにアップロード → 右クリック → 「アプリで開く」→「Googleドキュメント」で編集できます。</w:t>
+        <w:t>カンニング用アジェンダ</w:t>
       </w:r>
     </w:p>
     <w:p>
@@ -35,37 +17,25 @@
         <w:pStyle w:val="Heading1"/>
       </w:pPr>
       <w:r>
-        <w:rPr>
-          <w:rFonts w:ascii="Yu Gothic" w:hAnsi="Yu Gothic" w:eastAsia="Yu Gothic"/>
-          <w:b/>
-          <w:sz w:val="32"/>
-        </w:rPr>
-        <w:t>カンニング用アジェンダ（15分）</w:t>
+        <w:t>カンニング用アジェンダ（新テーマ版）</w:t>
       </w:r>
     </w:p>
     <w:p>
-      <w:pPr>
-        <w:spacing w:after="120"/>
-      </w:pPr>
       <w:r>
         <w:rPr>
           <w:rFonts w:ascii="Yu Gothic" w:hAnsi="Yu Gothic" w:eastAsia="Yu Gothic"/>
           <w:b w:val="0"/>
           <w:sz w:val="22"/>
         </w:rPr>
-        <w:t>印刷 or スマホ横置き想定／見たら即話す用</w:t>
+        <w:t>講師が横目で見る用／細かい正確さより全体像</w:t>
       </w:r>
     </w:p>
     <w:p/>
     <w:p>
-      <w:pPr>
-        <w:spacing w:after="120"/>
-      </w:pPr>
       <w:r>
         <w:rPr>
           <w:rFonts w:ascii="Yu Gothic" w:hAnsi="Yu Gothic" w:eastAsia="Yu Gothic"/>
           <w:b w:val="0"/>
-          <w:color w:val="94A3B8"/>
           <w:sz w:val="18"/>
         </w:rPr>
         <w:t>────────────────</w:t>
@@ -77,102 +47,46 @@
         <w:pStyle w:val="Heading2"/>
       </w:pPr>
       <w:r>
-        <w:rPr>
-          <w:rFonts w:ascii="Yu Gothic" w:hAnsi="Yu Gothic" w:eastAsia="Yu Gothic"/>
-          <w:b/>
-          <w:sz w:val="26"/>
-        </w:rPr>
-        <w:t>タイム配分</w:t>
+        <w:t>今日の一本</w:t>
       </w:r>
     </w:p>
     <w:p>
-      <w:pPr>
-        <w:spacing w:after="120"/>
-      </w:pPr>
       <w:r>
         <w:rPr>
           <w:rFonts w:ascii="Yu Gothic" w:hAnsi="Yu Gothic" w:eastAsia="Yu Gothic"/>
           <w:b w:val="0"/>
-          <w:sz w:val="20"/>
+          <w:sz w:val="22"/>
         </w:rPr>
-        <w:t>分 ｜ パート ｜ 出す図</w:t>
+        <w:t>老後対策 → 生涯収入を増やす → 働き方の立ち位置を決める</w:t>
       </w:r>
     </w:p>
     <w:p>
-      <w:pPr>
-        <w:spacing w:after="120"/>
-      </w:pPr>
       <w:r>
         <w:rPr>
           <w:rFonts w:ascii="Yu Gothic" w:hAnsi="Yu Gothic" w:eastAsia="Yu Gothic"/>
           <w:b w:val="0"/>
-          <w:sz w:val="20"/>
+          <w:sz w:val="22"/>
         </w:rPr>
-        <w:t>0–1 ｜ 導入・4ポイント ｜ 表紙／4ポイント</w:t>
+        <w:t>結論：社保の考え方をはっきりさせて、それに従って行動する</w:t>
       </w:r>
     </w:p>
+    <w:p/>
     <w:p>
-      <w:pPr>
-        <w:spacing w:after="120"/>
-      </w:pPr>
       <w:r>
         <w:rPr>
           <w:rFonts w:ascii="Yu Gothic" w:hAnsi="Yu Gothic" w:eastAsia="Yu Gothic"/>
           <w:b w:val="0"/>
-          <w:sz w:val="20"/>
+          <w:sz w:val="22"/>
         </w:rPr>
-        <w:t>1–4 ｜ 働き損＝3色 ｜ 早見図 → 手取り</w:t>
+        <w:t>前提：2026年10月以降／すでに働ける人／健康・介護は例外</w:t>
       </w:r>
     </w:p>
+    <w:p/>
     <w:p>
-      <w:pPr>
-        <w:spacing w:after="120"/>
-      </w:pPr>
       <w:r>
         <w:rPr>
           <w:rFonts w:ascii="Yu Gothic" w:hAnsi="Yu Gothic" w:eastAsia="Yu Gothic"/>
           <w:b w:val="0"/>
-          <w:sz w:val="20"/>
-        </w:rPr>
-        <w:t>4–8 ｜ 実質損・ご主人も損 ｜ v2拡大 → 内訳1枚 → 夫+100</w:t>
-      </w:r>
-    </w:p>
-    <w:p>
-      <w:pPr>
-        <w:spacing w:after="120"/>
-      </w:pPr>
-      <w:r>
-        <w:rPr>
-          <w:rFonts w:ascii="Yu Gothic" w:hAnsi="Yu Gothic" w:eastAsia="Yu Gothic"/>
-          <w:b w:val="0"/>
-          <w:sz w:val="20"/>
-        </w:rPr>
-        <w:t>8–12 ｜ 社保マップ ｜ 時系列 → ★9月vs10月 → ★範囲拡大</w:t>
-      </w:r>
-    </w:p>
-    <w:p>
-      <w:pPr>
-        <w:spacing w:after="120"/>
-      </w:pPr>
-      <w:r>
-        <w:rPr>
-          <w:rFonts w:ascii="Yu Gothic" w:hAnsi="Yu Gothic" w:eastAsia="Yu Gothic"/>
-          <w:b w:val="0"/>
-          <w:sz w:val="20"/>
-        </w:rPr>
-        <w:t>12–15 ｜ 4つに戻す・締め ｜ まとめ</w:t>
-      </w:r>
-    </w:p>
-    <w:p/>
-    <w:p>
-      <w:pPr>
-        <w:spacing w:after="120"/>
-      </w:pPr>
-      <w:r>
-        <w:rPr>
-          <w:rFonts w:ascii="Yu Gothic" w:hAnsi="Yu Gothic" w:eastAsia="Yu Gothic"/>
-          <w:b w:val="0"/>
-          <w:color w:val="94A3B8"/>
           <w:sz w:val="18"/>
         </w:rPr>
         <w:t>────────────────</w:t>
@@ -184,132 +98,197 @@
         <w:pStyle w:val="Heading2"/>
       </w:pPr>
       <w:r>
-        <w:rPr>
-          <w:rFonts w:ascii="Yu Gothic" w:hAnsi="Yu Gothic" w:eastAsia="Yu Gothic"/>
-          <w:b/>
-          <w:sz w:val="26"/>
-        </w:rPr>
-        <w:t>話す順（超短縮）</w:t>
-      </w:r>
-    </w:p>
-    <w:p/>
-    <w:p>
-      <w:pPr>
-        <w:pStyle w:val="Heading3"/>
-      </w:pPr>
-      <w:r>
-        <w:rPr>
-          <w:rFonts w:ascii="Yu Gothic" w:hAnsi="Yu Gothic" w:eastAsia="Yu Gothic"/>
-          <w:b/>
-          <w:sz w:val="26"/>
-        </w:rPr>
-        <w:t>0. 導入</w:t>
+        <w:t>話す順</w:t>
       </w:r>
     </w:p>
     <w:p>
-      <w:pPr>
-        <w:spacing w:after="120"/>
-      </w:pPr>
       <w:r>
         <w:rPr>
           <w:rFonts w:ascii="Yu Gothic" w:hAnsi="Yu Gothic" w:eastAsia="Yu Gothic"/>
           <w:b w:val="0"/>
           <w:sz w:val="22"/>
         </w:rPr>
-        <w:t>ルールが多い → 見る柱は少ない</w:t>
+        <w:t>1. テーマと前提（ほかの対策もするが、働くが本丸）</w:t>
       </w:r>
     </w:p>
     <w:p>
-      <w:pPr>
-        <w:spacing w:after="120"/>
-      </w:pPr>
       <w:r>
         <w:rPr>
           <w:rFonts w:ascii="Yu Gothic" w:hAnsi="Yu Gothic" w:eastAsia="Yu Gothic"/>
           <w:b w:val="0"/>
           <w:sz w:val="22"/>
         </w:rPr>
-        <w:t>今日のゴール＝働き方の見方が残る</w:t>
-      </w:r>
-    </w:p>
-    <w:p/>
-    <w:p>
-      <w:pPr>
-        <w:pStyle w:val="Heading3"/>
-      </w:pPr>
-      <w:r>
-        <w:rPr>
-          <w:rFonts w:ascii="Yu Gothic" w:hAnsi="Yu Gothic" w:eastAsia="Yu Gothic"/>
-          <w:b/>
-          <w:sz w:val="26"/>
-        </w:rPr>
-        <w:t>1. 4つのポイント（最初に言う）</w:t>
+        <w:t>2. いま：物価↑・最低賃金↑・時給↑</w:t>
       </w:r>
     </w:p>
     <w:p>
-      <w:pPr>
-        <w:spacing w:after="120"/>
-      </w:pPr>
       <w:r>
         <w:rPr>
           <w:rFonts w:ascii="Yu Gothic" w:hAnsi="Yu Gothic" w:eastAsia="Yu Gothic"/>
           <w:b w:val="0"/>
           <w:sz w:val="22"/>
         </w:rPr>
-        <w:t>1. 給与で社保の土台（10月〜＝週20h）</w:t>
+        <w:t>3. 50代：転職は難しい。今の場所を整える</w:t>
       </w:r>
     </w:p>
     <w:p>
-      <w:pPr>
-        <w:spacing w:after="120"/>
-      </w:pPr>
       <w:r>
         <w:rPr>
           <w:rFonts w:ascii="Yu Gothic" w:hAnsi="Yu Gothic" w:eastAsia="Yu Gothic"/>
           <w:b w:val="0"/>
           <w:sz w:val="22"/>
         </w:rPr>
-        <w:t>2. 複数収入でリスクヘッジ</w:t>
+        <w:t>4. 結論先出し：考え方を決めて行動</w:t>
       </w:r>
     </w:p>
     <w:p>
-      <w:pPr>
-        <w:spacing w:after="120"/>
-      </w:pPr>
       <w:r>
         <w:rPr>
           <w:rFonts w:ascii="Yu Gothic" w:hAnsi="Yu Gothic" w:eastAsia="Yu Gothic"/>
           <w:b w:val="0"/>
           <w:sz w:val="22"/>
         </w:rPr>
-        <w:t>3. 副業OK（扶養は合計年収）</w:t>
+        <w:t>5. 給料増やしたい→時間増やす→行き着く3色</w:t>
       </w:r>
     </w:p>
     <w:p>
-      <w:pPr>
-        <w:spacing w:after="120"/>
-      </w:pPr>
       <w:r>
         <w:rPr>
           <w:rFonts w:ascii="Yu Gothic" w:hAnsi="Yu Gothic" w:eastAsia="Yu Gothic"/>
           <w:b w:val="0"/>
           <w:sz w:val="22"/>
         </w:rPr>
-        <w:t>4. 目的は安くすることじゃない → 長く働ける自分</w:t>
+        <w:t>6. 緑=扶養／青=勤務先社保／赤=どっちでもない（最悪）</w:t>
+      </w:r>
+    </w:p>
+    <w:p>
+      <w:r>
+        <w:rPr>
+          <w:rFonts w:ascii="Yu Gothic" w:hAnsi="Yu Gothic" w:eastAsia="Yu Gothic"/>
+          <w:b w:val="0"/>
+          <w:sz w:val="22"/>
+        </w:rPr>
+        <w:t>7. 会社人数のイメージ</w:t>
+      </w:r>
+    </w:p>
+    <w:p>
+      <w:r>
+        <w:rPr>
+          <w:rFonts w:ascii="Yu Gothic" w:hAnsi="Yu Gothic" w:eastAsia="Yu Gothic"/>
+          <w:b w:val="0"/>
+          <w:sz w:val="22"/>
+        </w:rPr>
+        <w:t xml:space="preserve">   - 51以上：週20時間が入口</w:t>
+      </w:r>
+    </w:p>
+    <w:p>
+      <w:r>
+        <w:rPr>
+          <w:rFonts w:ascii="Yu Gothic" w:hAnsi="Yu Gothic" w:eastAsia="Yu Gothic"/>
+          <w:b w:val="0"/>
+          <w:sz w:val="22"/>
+        </w:rPr>
+        <w:t xml:space="preserve">   - 51未満：週20時間の道はまだ来てない → だいたい週30時間</w:t>
+      </w:r>
+    </w:p>
+    <w:p>
+      <w:r>
+        <w:rPr>
+          <w:rFonts w:ascii="Yu Gothic" w:hAnsi="Yu Gothic" w:eastAsia="Yu Gothic"/>
+          <w:b w:val="0"/>
+          <w:sz w:val="22"/>
+        </w:rPr>
+        <w:t>8. 間がつらい → どっちかに寄せる</w:t>
+      </w:r>
+    </w:p>
+    <w:p>
+      <w:r>
+        <w:rPr>
+          <w:rFonts w:ascii="Yu Gothic" w:hAnsi="Yu Gothic" w:eastAsia="Yu Gothic"/>
+          <w:b w:val="0"/>
+          <w:sz w:val="22"/>
+        </w:rPr>
+        <w:t>9. 会社もコスト増は嫌。でもまともな会社は良いコスト。A社vsB社</w:t>
+      </w:r>
+    </w:p>
+    <w:p>
+      <w:r>
+        <w:rPr>
+          <w:rFonts w:ascii="Yu Gothic" w:hAnsi="Yu Gothic" w:eastAsia="Yu Gothic"/>
+          <w:b w:val="0"/>
+          <w:sz w:val="22"/>
+        </w:rPr>
+        <w:t>10. 3択＋小話</w:t>
+      </w:r>
+    </w:p>
+    <w:p>
+      <w:r>
+        <w:rPr>
+          <w:rFonts w:ascii="Yu Gothic" w:hAnsi="Yu Gothic" w:eastAsia="Yu Gothic"/>
+          <w:b w:val="0"/>
+          <w:sz w:val="22"/>
+        </w:rPr>
+        <w:t>11. 結局どうする表</w:t>
+      </w:r>
+    </w:p>
+    <w:p>
+      <w:r>
+        <w:rPr>
+          <w:rFonts w:ascii="Yu Gothic" w:hAnsi="Yu Gothic" w:eastAsia="Yu Gothic"/>
+          <w:b w:val="0"/>
+          <w:sz w:val="22"/>
+        </w:rPr>
+        <w:t>12. なぜ会社に聞くか（ルール違いではなく自分の事実）</w:t>
+      </w:r>
+    </w:p>
+    <w:p>
+      <w:r>
+        <w:rPr>
+          <w:rFonts w:ascii="Yu Gothic" w:hAnsi="Yu Gothic" w:eastAsia="Yu Gothic"/>
+          <w:b w:val="0"/>
+          <w:sz w:val="22"/>
+        </w:rPr>
+        <w:t>13. 目線は10月だけで終わらない</w:t>
+      </w:r>
+    </w:p>
+    <w:p>
+      <w:r>
+        <w:rPr>
+          <w:rFonts w:ascii="Yu Gothic" w:hAnsi="Yu Gothic" w:eastAsia="Yu Gothic"/>
+          <w:b w:val="0"/>
+          <w:sz w:val="22"/>
+        </w:rPr>
+        <w:t>14. 宿題：①②③を書く／会社に聞く／シフトを合わせる</w:t>
+      </w:r>
+    </w:p>
+    <w:p/>
+    <w:p>
+      <w:r>
+        <w:rPr>
+          <w:rFonts w:ascii="Yu Gothic" w:hAnsi="Yu Gothic" w:eastAsia="Yu Gothic"/>
+          <w:b w:val="0"/>
+          <w:sz w:val="18"/>
+        </w:rPr>
+        <w:t>────────────────</w:t>
       </w:r>
     </w:p>
     <w:p/>
     <w:p>
       <w:pPr>
-        <w:pStyle w:val="Heading3"/>
+        <w:pStyle w:val="Heading2"/>
       </w:pPr>
+      <w:r>
+        <w:t>3択かんたん版</w:t>
+      </w:r>
+    </w:p>
+    <w:p>
       <w:r>
         <w:rPr>
           <w:rFonts w:ascii="Yu Gothic" w:hAnsi="Yu Gothic" w:eastAsia="Yu Gothic"/>
-          <w:b/>
-          <w:sz w:val="26"/>
+          <w:b w:val="0"/>
+          <w:sz w:val="22"/>
         </w:rPr>
-        <w:t>2. 働き損</w:t>
+        <w:t>① 当面は扶養内</w:t>
       </w:r>
     </w:p>
     <w:p>
@@ -322,7 +301,7 @@
           <w:b w:val="0"/>
           <w:sz w:val="22"/>
         </w:rPr>
-        <w:t>青勤務先社保 ／ 緑扶養 ／ 赤国保＋国年（キツい）</w:t>
+        <w:t>本命：年収130万を超えない</w:t>
       </w:r>
     </w:p>
     <w:p>
@@ -335,7 +314,7 @@
           <w:b w:val="0"/>
           <w:sz w:val="22"/>
         </w:rPr>
-        <w:t>稼いでも手取りが伸びにくい帯がある</w:t>
+        <w:t>高時給ほど注意</w:t>
       </w:r>
     </w:p>
     <w:p>
@@ -348,21 +327,18 @@
           <w:b w:val="0"/>
           <w:sz w:val="22"/>
         </w:rPr>
-        <w:t>「働くな」ではなく どこで働くか</w:t>
+        <w:t>51以上なら週20時間未満も見る</w:t>
       </w:r>
     </w:p>
     <w:p/>
     <w:p>
-      <w:pPr>
-        <w:pStyle w:val="Heading3"/>
-      </w:pPr>
       <w:r>
         <w:rPr>
           <w:rFonts w:ascii="Yu Gothic" w:hAnsi="Yu Gothic" w:eastAsia="Yu Gothic"/>
-          <w:b/>
-          <w:sz w:val="26"/>
+          <w:b w:val="0"/>
+          <w:sz w:val="22"/>
         </w:rPr>
-        <w:t>3. 損と実感ライン</w:t>
+        <w:t>② 勤務先社保に入る覚悟</w:t>
       </w:r>
     </w:p>
     <w:p>
@@ -375,7 +351,7 @@
           <w:b w:val="0"/>
           <w:sz w:val="22"/>
         </w:rPr>
-        <w:t>実質損＝扶養内（〜129万）と比べた感じ</w:t>
+        <w:t>51未満：だいたい週30時間以上</w:t>
       </w:r>
     </w:p>
     <w:p>
@@ -388,7 +364,7 @@
           <w:b w:val="0"/>
           <w:sz w:val="22"/>
         </w:rPr>
-        <w:t>制度の戻り：130→約150–160 ／ 106→約124</w:t>
+        <w:t>51以上：週20時間以上</w:t>
       </w:r>
     </w:p>
     <w:p>
@@ -401,7 +377,18 @@
           <w:b w:val="0"/>
           <w:sz w:val="22"/>
         </w:rPr>
-        <w:t>気持ちの戻り：106→176 ／ 130→200（年+70＝月+6）</w:t>
+        <w:t>＝扶養から外れる覚悟でもある</w:t>
+      </w:r>
+    </w:p>
+    <w:p/>
+    <w:p>
+      <w:r>
+        <w:rPr>
+          <w:rFonts w:ascii="Yu Gothic" w:hAnsi="Yu Gothic" w:eastAsia="Yu Gothic"/>
+          <w:b w:val="0"/>
+          <w:sz w:val="22"/>
+        </w:rPr>
+        <w:t>③ 外れて本気で稼ぐ</w:t>
       </w:r>
     </w:p>
     <w:p>
@@ -414,190 +401,15 @@
           <w:b w:val="0"/>
           <w:sz w:val="22"/>
         </w:rPr>
-        <w:t>損＝税＋社保＋配偶者特別控除 など重なる</w:t>
+        <w:t>少しだけ増やすのはやめる</w:t>
       </w:r>
     </w:p>
+    <w:p/>
     <w:p>
-      <w:pPr>
-        <w:pStyle w:val="ListBullet"/>
-      </w:pPr>
       <w:r>
         <w:rPr>
           <w:rFonts w:ascii="Yu Gothic" w:hAnsi="Yu Gothic" w:eastAsia="Yu Gothic"/>
           <w:b w:val="0"/>
-          <w:sz w:val="22"/>
-        </w:rPr>
-        <w:t>★ ご主人も損しながら稼いでいる</w:t>
-      </w:r>
-    </w:p>
-    <w:p>
-      <w:pPr>
-        <w:pStyle w:val="ListBullet"/>
-      </w:pPr>
-      <w:r>
-        <w:rPr>
-          <w:rFonts w:ascii="Yu Gothic" w:hAnsi="Yu Gothic" w:eastAsia="Yu Gothic"/>
-          <w:b w:val="0"/>
-          <w:sz w:val="22"/>
-        </w:rPr>
-        <w:t>★ 中途半端NG → 壁の手前か向こう側</w:t>
-      </w:r>
-    </w:p>
-    <w:p/>
-    <w:p>
-      <w:pPr>
-        <w:pStyle w:val="Heading3"/>
-      </w:pPr>
-      <w:r>
-        <w:rPr>
-          <w:rFonts w:ascii="Yu Gothic" w:hAnsi="Yu Gothic" w:eastAsia="Yu Gothic"/>
-          <w:b/>
-          <w:sz w:val="26"/>
-        </w:rPr>
-        <w:t>4. 社保マップ（図解で）</w:t>
-      </w:r>
-    </w:p>
-    <w:p>
-      <w:pPr>
-        <w:pStyle w:val="ListBullet"/>
-      </w:pPr>
-      <w:r>
-        <w:rPr>
-          <w:rFonts w:ascii="Yu Gothic" w:hAnsi="Yu Gothic" w:eastAsia="Yu Gothic"/>
-          <w:b w:val="0"/>
-          <w:sz w:val="22"/>
-        </w:rPr>
-        <w:t>10月〜：賃金要件撤廃 → 週20hが主軸（51人以上）</w:t>
-      </w:r>
-    </w:p>
-    <w:p>
-      <w:pPr>
-        <w:pStyle w:val="ListBullet"/>
-      </w:pPr>
-      <w:r>
-        <w:rPr>
-          <w:rFonts w:ascii="Yu Gothic" w:hAnsi="Yu Gothic" w:eastAsia="Yu Gothic"/>
-          <w:b w:val="0"/>
-          <w:sz w:val="22"/>
-        </w:rPr>
-        <w:t>50人以下：当面おおよそ週30h（3/4）</w:t>
-      </w:r>
-    </w:p>
-    <w:p>
-      <w:pPr>
-        <w:pStyle w:val="ListBullet"/>
-      </w:pPr>
-      <w:r>
-        <w:rPr>
-          <w:rFonts w:ascii="Yu Gothic" w:hAnsi="Yu Gothic" w:eastAsia="Yu Gothic"/>
-          <w:b w:val="0"/>
-          <w:sz w:val="22"/>
-        </w:rPr>
-        <w:t>2027/10〜：同じ地図が 36人以上へ広がる（35以下は当面外）</w:t>
-      </w:r>
-    </w:p>
-    <w:p>
-      <w:pPr>
-        <w:pStyle w:val="ListBullet"/>
-      </w:pPr>
-      <w:r>
-        <w:rPr>
-          <w:rFonts w:ascii="Yu Gothic" w:hAnsi="Yu Gothic" w:eastAsia="Yu Gothic"/>
-          <w:b w:val="0"/>
-          <w:sz w:val="22"/>
-        </w:rPr>
-        <w:t>★ 形は同じ／範囲だけ拡大</w:t>
-      </w:r>
-    </w:p>
-    <w:p>
-      <w:pPr>
-        <w:pStyle w:val="ListBullet"/>
-      </w:pPr>
-      <w:r>
-        <w:rPr>
-          <w:rFonts w:ascii="Yu Gothic" w:hAnsi="Yu Gothic" w:eastAsia="Yu Gothic"/>
-          <w:b w:val="0"/>
-          <w:sz w:val="22"/>
-        </w:rPr>
-        <w:t>社保に乗れない→扶養が合理的も多い</w:t>
-      </w:r>
-    </w:p>
-    <w:p>
-      <w:pPr>
-        <w:spacing w:after="120"/>
-      </w:pPr>
-      <w:r>
-        <w:rPr>
-          <w:rFonts w:ascii="Yu Gothic" w:hAnsi="Yu Gothic" w:eastAsia="Yu Gothic"/>
-          <w:b w:val="0"/>
-          <w:sz w:val="22"/>
-        </w:rPr>
-        <w:t xml:space="preserve">  外れる→国保で中途半端はキツい → めちゃ稼ぐ／本気なら法人</w:t>
-      </w:r>
-    </w:p>
-    <w:p/>
-    <w:p>
-      <w:pPr>
-        <w:pStyle w:val="Heading3"/>
-      </w:pPr>
-      <w:r>
-        <w:rPr>
-          <w:rFonts w:ascii="Yu Gothic" w:hAnsi="Yu Gothic" w:eastAsia="Yu Gothic"/>
-          <w:b/>
-          <w:sz w:val="26"/>
-        </w:rPr>
-        <w:t>5. 締め（4つに戻す）</w:t>
-      </w:r>
-    </w:p>
-    <w:p>
-      <w:pPr>
-        <w:spacing w:after="120"/>
-      </w:pPr>
-      <w:r>
-        <w:rPr>
-          <w:rFonts w:ascii="Yu Gothic" w:hAnsi="Yu Gothic" w:eastAsia="Yu Gothic"/>
-          <w:b w:val="0"/>
-          <w:sz w:val="22"/>
-        </w:rPr>
-        <w:t>給与で土台 → 収入源を分散 → 副業は合計で見る → 生涯収入・年金を守る</w:t>
-      </w:r>
-    </w:p>
-    <w:p>
-      <w:pPr>
-        <w:spacing w:after="120"/>
-      </w:pPr>
-      <w:r>
-        <w:rPr>
-          <w:rFonts w:ascii="Yu Gothic" w:hAnsi="Yu Gothic" w:eastAsia="Yu Gothic"/>
-          <w:b w:val="0"/>
-          <w:sz w:val="22"/>
-        </w:rPr>
-        <w:t>物価高／700万＋子2人も楽じゃない／妻は長生き・年金薄い世代</w:t>
-      </w:r>
-    </w:p>
-    <w:p>
-      <w:pPr>
-        <w:spacing w:after="120"/>
-      </w:pPr>
-      <w:r>
-        <w:rPr>
-          <w:rFonts w:ascii="Yu Gothic" w:hAnsi="Yu Gothic" w:eastAsia="Yu Gothic"/>
-          <w:b w:val="0"/>
-          <w:sz w:val="22"/>
-        </w:rPr>
-        <w:t>→ 損を恐れて止まらない／手前か向こう</w:t>
-      </w:r>
-    </w:p>
-    <w:p/>
-    <w:p>
-      <w:pPr>
-        <w:spacing w:after="120"/>
-      </w:pPr>
-      <w:r>
-        <w:rPr>
-          <w:rFonts w:ascii="Yu Gothic" w:hAnsi="Yu Gothic" w:eastAsia="Yu Gothic"/>
-          <w:b w:val="0"/>
-          <w:color w:val="94A3B8"/>
           <w:sz w:val="18"/>
         </w:rPr>
         <w:t>────────────────</w:t>
@@ -609,51 +421,17 @@
         <w:pStyle w:val="Heading2"/>
       </w:pPr>
       <w:r>
-        <w:rPr>
-          <w:rFonts w:ascii="Yu Gothic" w:hAnsi="Yu Gothic" w:eastAsia="Yu Gothic"/>
-          <w:b/>
-          <w:sz w:val="26"/>
-        </w:rPr>
-        <w:t>絶対言わない／言いすぎ注意</w:t>
+        <w:t>詰まったら戻る一言</w:t>
       </w:r>
     </w:p>
     <w:p>
-      <w:pPr>
-        <w:pStyle w:val="ListBullet"/>
-      </w:pPr>
       <w:r>
         <w:rPr>
           <w:rFonts w:ascii="Yu Gothic" w:hAnsi="Yu Gothic" w:eastAsia="Yu Gothic"/>
           <w:b w:val="0"/>
           <w:sz w:val="22"/>
         </w:rPr>
-        <w:t>資産運用・商品の話（今日の主題外）</w:t>
-      </w:r>
-    </w:p>
-    <w:p>
-      <w:pPr>
-        <w:pStyle w:val="ListBullet"/>
-      </w:pPr>
-      <w:r>
-        <w:rPr>
-          <w:rFonts w:ascii="Yu Gothic" w:hAnsi="Yu Gothic" w:eastAsia="Yu Gothic"/>
-          <w:b w:val="0"/>
-          <w:sz w:val="22"/>
-        </w:rPr>
-        <w:t>「稼げるだけ稼げ」（危険）</w:t>
-      </w:r>
-    </w:p>
-    <w:p>
-      <w:pPr>
-        <w:pStyle w:val="ListBullet"/>
-      </w:pPr>
-      <w:r>
-        <w:rPr>
-          <w:rFonts w:ascii="Yu Gothic" w:hAnsi="Yu Gothic" w:eastAsia="Yu Gothic"/>
-          <w:b w:val="0"/>
-          <w:sz w:val="22"/>
-        </w:rPr>
-        <w:t>個別の加入可否の断定（会社規模・週時間が先）</w:t>
+        <w:t>「間に長くいない。手前か、向こうか。」</w:t>
       </w:r>
     </w:p>
     <w:p/>
@@ -662,83 +440,22 @@
         <w:pStyle w:val="Heading2"/>
       </w:pPr>
       <w:r>
-        <w:rPr>
-          <w:rFonts w:ascii="Yu Gothic" w:hAnsi="Yu Gothic" w:eastAsia="Yu Gothic"/>
-          <w:b/>
-          <w:sz w:val="26"/>
-        </w:rPr>
-        <w:t>詰まったときの一言</w:t>
+        <w:t>言わない</w:t>
       </w:r>
     </w:p>
     <w:p>
-      <w:pPr>
-        <w:spacing w:after="120"/>
-      </w:pPr>
       <w:r>
         <w:rPr>
           <w:rFonts w:ascii="Yu Gothic" w:hAnsi="Yu Gothic" w:eastAsia="Yu Gothic"/>
           <w:b w:val="0"/>
           <w:sz w:val="22"/>
         </w:rPr>
-        <w:t>「細かい数字より、色と週の時間で見てください」</w:t>
-      </w:r>
-    </w:p>
-    <w:p/>
-    <w:p>
-      <w:pPr>
-        <w:pStyle w:val="Heading2"/>
-      </w:pPr>
-      <w:r>
-        <w:rPr>
-          <w:rFonts w:ascii="Yu Gothic" w:hAnsi="Yu Gothic" w:eastAsia="Yu Gothic"/>
-          <w:b/>
-          <w:sz w:val="26"/>
-        </w:rPr>
-        <w:t>FAQ一行</w:t>
-      </w:r>
-    </w:p>
-    <w:p>
-      <w:pPr>
-        <w:pStyle w:val="ListBullet"/>
-      </w:pPr>
-      <w:r>
-        <w:rPr>
-          <w:rFonts w:ascii="Yu Gothic" w:hAnsi="Yu Gothic" w:eastAsia="Yu Gothic"/>
-          <w:b w:val="0"/>
-          <w:sz w:val="22"/>
-        </w:rPr>
-        <w:t>扶養のまま？→ 社保に乗れないなら合理も多い。人数と週時間から</w:t>
-      </w:r>
-    </w:p>
-    <w:p>
-      <w:pPr>
-        <w:pStyle w:val="ListBullet"/>
-      </w:pPr>
-      <w:r>
-        <w:rPr>
-          <w:rFonts w:ascii="Yu Gothic" w:hAnsi="Yu Gothic" w:eastAsia="Yu Gothic"/>
-          <w:b w:val="0"/>
-          <w:sz w:val="22"/>
-        </w:rPr>
-        <w:t>いくらまで？→ 手前か向こう。176/200は気持ちのライン</w:t>
-      </w:r>
-    </w:p>
-    <w:p>
-      <w:pPr>
-        <w:pStyle w:val="ListBullet"/>
-      </w:pPr>
-      <w:r>
-        <w:rPr>
-          <w:rFonts w:ascii="Yu Gothic" w:hAnsi="Yu Gothic" w:eastAsia="Yu Gothic"/>
-          <w:b w:val="0"/>
-          <w:sz w:val="22"/>
-        </w:rPr>
-        <w:t>副業？→ 合計年収で外れることがある</w:t>
+        <w:t>資産運用の本丸／個別加入の断定／細かい条文対決</w:t>
       </w:r>
     </w:p>
     <w:sectPr>
       <w:pgSz w:w="12240" w:h="15840"/>
-      <w:pgMar w:top="1080" w:right="1440" w:bottom="1080" w:left="1440" w:header="720" w:footer="720" w:gutter="0"/>
+      <w:pgMar w:top="1440" w:right="1800" w:bottom="1440" w:left="1800" w:header="720" w:footer="720" w:gutter="0"/>
       <w:cols w:space="720"/>
       <w:docGrid w:linePitch="360"/>
     </w:sectPr>

</xml_diff>

<commit_message>
Apply review fixes to seminar script and cheat agenda
Clarify prescribed hours, soften 50s and company framing, protect choice ①, fix timing estimates, and add pitfall notes for the day-of sheet.

Co-authored-by: love2u2aya <love2u2aya@users.noreply.github.com>
</commit_message>
<xml_diff>
--- a/seminar-materials/カンニング用アジェンダ_Googleドキュメント用.docx
+++ b/seminar-materials/カンニング用アジェンダ_Googleドキュメント用.docx
@@ -17,28 +17,7 @@
         <w:pStyle w:val="Heading1"/>
       </w:pPr>
       <w:r>
-        <w:t>カンニング用アジェンダ（新テーマ版）</w:t>
-      </w:r>
-    </w:p>
-    <w:p>
-      <w:r>
-        <w:rPr>
-          <w:rFonts w:ascii="Yu Gothic" w:hAnsi="Yu Gothic" w:eastAsia="Yu Gothic"/>
-          <w:b w:val="0"/>
-          <w:sz w:val="22"/>
-        </w:rPr>
-        <w:t>講師が横目で見る用／細かい正確さより全体像</w:t>
-      </w:r>
-    </w:p>
-    <w:p/>
-    <w:p>
-      <w:r>
-        <w:rPr>
-          <w:rFonts w:ascii="Yu Gothic" w:hAnsi="Yu Gothic" w:eastAsia="Yu Gothic"/>
-          <w:b w:val="0"/>
-          <w:sz w:val="18"/>
-        </w:rPr>
-        <w:t>────────────────</w:t>
+        <w:t>カンニング用アジェンダ（本番横目用）</w:t>
       </w:r>
     </w:p>
     <w:p/>
@@ -81,6 +60,16 @@
         <w:t>前提：2026年10月以降／すでに働ける人／健康・介護は例外</w:t>
       </w:r>
     </w:p>
+    <w:p>
+      <w:r>
+        <w:rPr>
+          <w:rFonts w:ascii="Yu Gothic" w:hAnsi="Yu Gothic" w:eastAsia="Yu Gothic"/>
+          <w:b w:val="0"/>
+          <w:sz w:val="22"/>
+        </w:rPr>
+        <w:t>時間：フル35〜40分／短縮15〜18分</w:t>
+      </w:r>
+    </w:p>
     <w:p/>
     <w:p>
       <w:r>
@@ -98,7 +87,7 @@
         <w:pStyle w:val="Heading2"/>
       </w:pPr>
       <w:r>
-        <w:t>話す順</w:t>
+        <w:t>話す順（短縮は★だけでも可）</w:t>
       </w:r>
     </w:p>
     <w:p>
@@ -108,7 +97,7 @@
           <w:b w:val="0"/>
           <w:sz w:val="22"/>
         </w:rPr>
-        <w:t>1. テーマと前提（ほかの対策もするが、働くが本丸）</w:t>
+        <w:t>1. テーマと前提</w:t>
       </w:r>
     </w:p>
     <w:p>
@@ -118,7 +107,7 @@
           <w:b w:val="0"/>
           <w:sz w:val="22"/>
         </w:rPr>
-        <w:t>2. いま：物価↑・最低賃金↑・時給↑</w:t>
+        <w:t>2. いま：物価↑・最低賃金↑・時給↑（短縮は1文）</w:t>
       </w:r>
     </w:p>
     <w:p>
@@ -128,7 +117,7 @@
           <w:b w:val="0"/>
           <w:sz w:val="22"/>
         </w:rPr>
-        <w:t>3. 50代：転職は難しい。今の場所を整える</w:t>
+        <w:t>3. 50代：転職前提ではない（短縮は1文）</w:t>
       </w:r>
     </w:p>
     <w:p>
@@ -138,7 +127,7 @@
           <w:b w:val="0"/>
           <w:sz w:val="22"/>
         </w:rPr>
-        <w:t>4. 結論先出し：考え方を決めて行動</w:t>
+        <w:t>4. ★結論先出し</w:t>
       </w:r>
     </w:p>
     <w:p>
@@ -148,7 +137,7 @@
           <w:b w:val="0"/>
           <w:sz w:val="22"/>
         </w:rPr>
-        <w:t>5. 給料増やしたい→時間増やす→行き着く3色</w:t>
+        <w:t>5. ★給料増やしたい→時間増やす→3色</w:t>
       </w:r>
     </w:p>
     <w:p>
@@ -158,7 +147,7 @@
           <w:b w:val="0"/>
           <w:sz w:val="22"/>
         </w:rPr>
-        <w:t>6. 緑=扶養／青=勤務先社保／赤=どっちでもない（最悪）</w:t>
+        <w:t>6. ★緑=扶養／青=勤務先社保／赤=どっちでもない（最悪）</w:t>
       </w:r>
     </w:p>
     <w:p>
@@ -168,7 +157,7 @@
           <w:b w:val="0"/>
           <w:sz w:val="22"/>
         </w:rPr>
-        <w:t>7. 会社人数のイメージ</w:t>
+        <w:t>7. ★会社人数のイメージ</w:t>
       </w:r>
     </w:p>
     <w:p>
@@ -178,7 +167,7 @@
           <w:b w:val="0"/>
           <w:sz w:val="22"/>
         </w:rPr>
-        <w:t xml:space="preserve">   - 51以上：週20時間が入口</w:t>
+        <w:t xml:space="preserve">   - 51以上：週20時間（所定）が入口</w:t>
       </w:r>
     </w:p>
     <w:p>
@@ -188,7 +177,7 @@
           <w:b w:val="0"/>
           <w:sz w:val="22"/>
         </w:rPr>
-        <w:t xml:space="preserve">   - 51未満：週20時間の道はまだ来てない → だいたい週30時間</w:t>
+        <w:t xml:space="preserve">   - 51未満：週20時間の道はまだ → だいたい週30時間</w:t>
       </w:r>
     </w:p>
     <w:p>
@@ -198,7 +187,7 @@
           <w:b w:val="0"/>
           <w:sz w:val="22"/>
         </w:rPr>
-        <w:t>8. 間がつらい → どっちかに寄せる</w:t>
+        <w:t>8. ★間がつらい → どっちかに寄せる</w:t>
       </w:r>
     </w:p>
     <w:p>
@@ -208,7 +197,7 @@
           <w:b w:val="0"/>
           <w:sz w:val="22"/>
         </w:rPr>
-        <w:t>9. 会社もコスト増は嫌。でもまともな会社は良いコスト。A社vsB社</w:t>
+        <w:t>9. 会社側の事情（①を責めない。短縮は薄く）</w:t>
       </w:r>
     </w:p>
     <w:p>
@@ -218,7 +207,7 @@
           <w:b w:val="0"/>
           <w:sz w:val="22"/>
         </w:rPr>
-        <w:t>10. 3択＋小話</w:t>
+        <w:t>10. 3択＋小話（短縮は美紀さん1本まで）</w:t>
       </w:r>
     </w:p>
     <w:p>
@@ -228,7 +217,7 @@
           <w:b w:val="0"/>
           <w:sz w:val="22"/>
         </w:rPr>
-        <w:t>11. 結局どうする表</w:t>
+        <w:t>11. ★結局どうする表</w:t>
       </w:r>
     </w:p>
     <w:p>
@@ -238,7 +227,7 @@
           <w:b w:val="0"/>
           <w:sz w:val="22"/>
         </w:rPr>
-        <w:t>12. なぜ会社に聞くか（ルール違いではなく自分の事実）</w:t>
+        <w:t>12. 会社に聞く理由（短縮は質問文だけ）</w:t>
       </w:r>
     </w:p>
     <w:p>
@@ -248,7 +237,7 @@
           <w:b w:val="0"/>
           <w:sz w:val="22"/>
         </w:rPr>
-        <w:t>13. 目線は10月だけで終わらない</w:t>
+        <w:t>13. 目線は10月だけで終わらない（短縮は1文）</w:t>
       </w:r>
     </w:p>
     <w:p>
@@ -258,7 +247,7 @@
           <w:b w:val="0"/>
           <w:sz w:val="22"/>
         </w:rPr>
-        <w:t>14. 宿題：①②③を書く／会社に聞く／シフトを合わせる</w:t>
+        <w:t>14. ★宿題：①②③を書く／会社に聞く</w:t>
       </w:r>
     </w:p>
     <w:p/>
@@ -288,7 +277,7 @@
           <w:b w:val="0"/>
           <w:sz w:val="22"/>
         </w:rPr>
-        <w:t>① 当面は扶養内</w:t>
+        <w:t>① 当面は扶養内（悪い選択ではない）</w:t>
       </w:r>
     </w:p>
     <w:p>
@@ -327,7 +316,7 @@
           <w:b w:val="0"/>
           <w:sz w:val="22"/>
         </w:rPr>
-        <w:t>51以上なら週20時間未満も見る</w:t>
+        <w:t>51以上なら週20時間未満（所定）も見る</w:t>
       </w:r>
     </w:p>
     <w:p/>
@@ -364,7 +353,7 @@
           <w:b w:val="0"/>
           <w:sz w:val="22"/>
         </w:rPr>
-        <w:t>51以上：週20時間以上</w:t>
+        <w:t>51以上：週20時間以上（所定）</w:t>
       </w:r>
     </w:p>
     <w:p>
@@ -421,6 +410,106 @@
         <w:pStyle w:val="Heading2"/>
       </w:pPr>
       <w:r>
+        <w:t>落とし穴メモ（これだけは間違えない）</w:t>
+      </w:r>
+    </w:p>
+    <w:p>
+      <w:r>
+        <w:rPr>
+          <w:rFonts w:ascii="Yu Gothic" w:hAnsi="Yu Gothic" w:eastAsia="Yu Gothic"/>
+          <w:b w:val="0"/>
+          <w:sz w:val="22"/>
+        </w:rPr>
+        <w:t>1. 人数と時間を逆にしない → 51以上=週20／51未満=だいたい週30。「51未満は週20の道がまだ来てない」</w:t>
+      </w:r>
+    </w:p>
+    <w:p>
+      <w:r>
+        <w:rPr>
+          <w:rFonts w:ascii="Yu Gothic" w:hAnsi="Yu Gothic" w:eastAsia="Yu Gothic"/>
+          <w:b w:val="0"/>
+          <w:sz w:val="22"/>
+        </w:rPr>
+        <w:t>2. 51人＝店の頭数とは限らない → 会社に確認</w:t>
+      </w:r>
+    </w:p>
+    <w:p>
+      <w:r>
+        <w:rPr>
+          <w:rFonts w:ascii="Yu Gothic" w:hAnsi="Yu Gothic" w:eastAsia="Yu Gothic"/>
+          <w:b w:val="0"/>
+          <w:sz w:val="22"/>
+        </w:rPr>
+        <w:t>3. 週20時間＝所定が基本。残業でたまたま、とは限らない</w:t>
+      </w:r>
+    </w:p>
+    <w:p>
+      <w:r>
+        <w:rPr>
+          <w:rFonts w:ascii="Yu Gothic" w:hAnsi="Yu Gothic" w:eastAsia="Yu Gothic"/>
+          <w:b w:val="0"/>
+          <w:sz w:val="22"/>
+        </w:rPr>
+        <w:t>4. 3本の線は別物 → 旧106万(もう見ない)／130万(扶養)／週20時間(勤務先社保)。混ぜない</w:t>
+      </w:r>
+    </w:p>
+    <w:p>
+      <w:r>
+        <w:rPr>
+          <w:rFonts w:ascii="Yu Gothic" w:hAnsi="Yu Gothic" w:eastAsia="Yu Gothic"/>
+          <w:b w:val="0"/>
+          <w:sz w:val="22"/>
+        </w:rPr>
+        <w:t>5. ①の人にも3点セット → 130万・高時給ほど少ない時間で超える・51以上なら週20未満も見る</w:t>
+      </w:r>
+    </w:p>
+    <w:p>
+      <w:r>
+        <w:rPr>
+          <w:rFonts w:ascii="Yu Gothic" w:hAnsi="Yu Gothic" w:eastAsia="Yu Gothic"/>
+          <w:b w:val="0"/>
+          <w:sz w:val="22"/>
+        </w:rPr>
+        <w:t>6. 51人未満＝社保なし、ではない（週30時間前後の道はある）</w:t>
+      </w:r>
+    </w:p>
+    <w:p>
+      <w:r>
+        <w:rPr>
+          <w:rFonts w:ascii="Yu Gothic" w:hAnsi="Yu Gothic" w:eastAsia="Yu Gothic"/>
+          <w:b w:val="0"/>
+          <w:sz w:val="22"/>
+        </w:rPr>
+        <w:t>7. ①を選んでも悪いわけではない。つらいのは間に居続けること</w:t>
+      </w:r>
+    </w:p>
+    <w:p>
+      <w:r>
+        <w:rPr>
+          <w:rFonts w:ascii="Yu Gothic" w:hAnsi="Yu Gothic" w:eastAsia="Yu Gothic"/>
+          <w:b w:val="0"/>
+          <w:sz w:val="22"/>
+        </w:rPr>
+        <w:t>8. 「会社に聞く理由」はルール違いでなく“あなたの事実”。ゆっくり言う</w:t>
+      </w:r>
+    </w:p>
+    <w:p/>
+    <w:p>
+      <w:r>
+        <w:rPr>
+          <w:rFonts w:ascii="Yu Gothic" w:hAnsi="Yu Gothic" w:eastAsia="Yu Gothic"/>
+          <w:b w:val="0"/>
+          <w:sz w:val="18"/>
+        </w:rPr>
+        <w:t>────────────────</w:t>
+      </w:r>
+    </w:p>
+    <w:p/>
+    <w:p>
+      <w:pPr>
+        <w:pStyle w:val="Heading2"/>
+      </w:pPr>
+      <w:r>
         <w:t>詰まったら戻る一言</w:t>
       </w:r>
     </w:p>
@@ -431,7 +520,7 @@
           <w:b w:val="0"/>
           <w:sz w:val="22"/>
         </w:rPr>
-        <w:t>「間に長くいない。手前か、向こうか。」</w:t>
+        <w:t>「手前か、向こうか。間に長くいない。」</w:t>
       </w:r>
     </w:p>
     <w:p/>
@@ -450,7 +539,7 @@
           <w:b w:val="0"/>
           <w:sz w:val="22"/>
         </w:rPr>
-        <w:t>資産運用の本丸／個別加入の断定／細かい条文対決</w:t>
+        <w:t>資産運用の本丸／個別加入の断定／細かい条文対決／①を選ぶ人を責める言い方</w:t>
       </w:r>
     </w:p>
     <w:sectPr>

</xml_diff>